<commit_message>
Standardize table/figure environments and add PreBotC manuscript with dependencies
</commit_message>
<xml_diff>
--- a/publication/conductance_table.docx
+++ b/publication/conductance_table.docx
@@ -8,7 +8,7 @@
         <w:pStyle w:val="TableCaption"/>
       </w:pPr>
       <w:r>
-        <w:t xml:space="preserve">Summary of reconstructed synaptic conductances across neuronal populations.</w:t>
+        <w:t xml:space="preserve">Summary of reconstructed synaptic conductances normalized by leak conductance across neuronal populations.</w:t>
       </w:r>
     </w:p>
     <w:tbl>
@@ -16,7 +16,7 @@
         <w:tblStyle w:val="Table"/>
         <w:tblW w:type="auto" w:w="0"/>
         <w:tblLook w:firstRow="1" w:lastRow="0" w:firstColumn="0" w:lastColumn="0" w:noHBand="0" w:noVBand="0" w:val="0020"/>
-        <w:tblCaption w:val="Summary of reconstructed synaptic conductances across neuronal populations."/>
+        <w:tblCaption w:val="Summary of reconstructed synaptic conductances normalized by leak conductance across neuronal populations."/>
       </w:tblPr>
       <w:tblGrid>
         <w:gridCol w:w="1584"/>
@@ -79,13 +79,34 @@
                   </m:r>
                 </m:sub>
               </m:sSub>
+              <m:r>
+                <m:rPr>
+                  <m:sty m:val="p"/>
+                </m:rPr>
+                <m:t>/</m:t>
+              </m:r>
+              <m:sSub>
+                <m:e>
+                  <m:r>
+                    <m:t>g</m:t>
+                  </m:r>
+                </m:e>
+                <m:sub>
+                  <m:r>
+                    <m:t>l</m:t>
+                  </m:r>
+                  <m:r>
+                    <m:t>e</m:t>
+                  </m:r>
+                  <m:r>
+                    <m:t>a</m:t>
+                  </m:r>
+                  <m:r>
+                    <m:t>k</m:t>
+                  </m:r>
+                </m:sub>
+              </m:sSub>
             </m:oMath>
-            <w:r>
-              <w:t xml:space="preserve"> </w:t>
-            </w:r>
-            <w:r>
-              <w:t xml:space="preserve">(nS)</w:t>
-            </w:r>
           </w:p>
         </w:tc>
         <w:tc>
@@ -114,13 +135,34 @@
                   </m:r>
                 </m:sub>
               </m:sSub>
+              <m:r>
+                <m:rPr>
+                  <m:sty m:val="p"/>
+                </m:rPr>
+                <m:t>/</m:t>
+              </m:r>
+              <m:sSub>
+                <m:e>
+                  <m:r>
+                    <m:t>g</m:t>
+                  </m:r>
+                </m:e>
+                <m:sub>
+                  <m:r>
+                    <m:t>l</m:t>
+                  </m:r>
+                  <m:r>
+                    <m:t>e</m:t>
+                  </m:r>
+                  <m:r>
+                    <m:t>a</m:t>
+                  </m:r>
+                  <m:r>
+                    <m:t>k</m:t>
+                  </m:r>
+                </m:sub>
+              </m:sSub>
             </m:oMath>
-            <w:r>
-              <w:t xml:space="preserve"> </w:t>
-            </w:r>
-            <w:r>
-              <w:t xml:space="preserve">(nS)</w:t>
-            </w:r>
           </w:p>
         </w:tc>
         <w:tc>
@@ -165,7 +207,7 @@
               <w:jc w:val="center"/>
             </w:pPr>
             <w:r>
-              <w:t xml:space="preserve">0.007</w:t>
+              <w:t xml:space="preserve">0.006</w:t>
             </w:r>
             <w:r>
               <w:t xml:space="preserve"> </w:t>
@@ -194,7 +236,7 @@
               <w:jc w:val="center"/>
             </w:pPr>
             <w:r>
-              <w:t xml:space="preserve">0.087</w:t>
+              <w:t xml:space="preserve">0.089</w:t>
             </w:r>
             <w:r>
               <w:t xml:space="preserve"> </w:t>
@@ -282,7 +324,7 @@
               <w:jc w:val="center"/>
             </w:pPr>
             <w:r>
-              <w:t xml:space="preserve">0.167</w:t>
+              <w:t xml:space="preserve">0.168</w:t>
             </w:r>
             <w:r>
               <w:t xml:space="preserve"> </w:t>

</xml_diff>